<commit_message>
Avance Update Word (Compromiso con la Etica) V5 CYRGO
</commit_message>
<xml_diff>
--- a/webapp/templates/word/Compromiso_Etica_Diaco.docx
+++ b/webapp/templates/word/Compromiso_Etica_Diaco.docx
@@ -1,6 +1,6 @@
 
 <file path=word/document.xml><?xml version="1.0" encoding="utf-8"?>
-<w:document xmlns:wpc="http://schemas.microsoft.com/office/word/2010/wordprocessingCanvas" xmlns:cx="http://schemas.microsoft.com/office/drawing/2014/chartex" xmlns:cx1="http://schemas.microsoft.com/office/drawing/2015/9/8/chartex" xmlns:cx2="http://schemas.microsoft.com/office/drawing/2015/10/21/chartex" xmlns:cx3="http://schemas.microsoft.com/office/drawing/2016/5/9/chartex" xmlns:cx4="http://schemas.microsoft.com/office/drawing/2016/5/10/chartex" xmlns:cx5="http://schemas.microsoft.com/office/drawing/2016/5/11/chartex" xmlns:cx6="http://schemas.microsoft.com/office/drawing/2016/5/12/chartex" xmlns:cx7="http://schemas.microsoft.com/office/drawing/2016/5/13/chartex" xmlns:cx8="http://schemas.microsoft.com/office/drawing/2016/5/14/chartex" xmlns:mc="http://schemas.openxmlformats.org/markup-compatibility/2006" xmlns:aink="http://schemas.microsoft.com/office/drawing/2016/ink" xmlns:am3d="http://schemas.microsoft.com/office/drawing/2017/model3d" xmlns:o="urn:schemas-microsoft-com:office:office" xmlns:oel="http://schemas.microsoft.com/office/2019/extlst" xmlns:r="http://schemas.openxmlformats.org/officeDocument/2006/relationships" xmlns:m="http://schemas.openxmlformats.org/officeDocument/2006/math" xmlns:v="urn:schemas-microsoft-com:vml" xmlns:wp14="http://schemas.microsoft.com/office/word/2010/wordprocessingDrawing" xmlns:wp="http://schemas.openxmlformats.org/drawingml/2006/wordprocessingDrawing" xmlns:w10="urn:schemas-microsoft-com:office:word" xmlns:w="http://schemas.openxmlformats.org/wordprocessingml/2006/main" xmlns:w14="http://schemas.microsoft.com/office/word/2010/wordml" xmlns:w15="http://schemas.microsoft.com/office/word/2012/wordml" xmlns:w16cex="http://schemas.microsoft.com/office/word/2018/wordml/cex" xmlns:w16cid="http://schemas.microsoft.com/office/word/2016/wordml/cid" xmlns:w16="http://schemas.microsoft.com/office/word/2018/wordml" xmlns:w16du="http://schemas.microsoft.com/office/word/2023/wordml/word16du" xmlns:w16sdtdh="http://schemas.microsoft.com/office/word/2020/wordml/sdtdatahash" xmlns:w16se="http://schemas.microsoft.com/office/word/2015/wordml/symex" xmlns:wpg="http://schemas.microsoft.com/office/word/2010/wordprocessingGroup" xmlns:wpi="http://schemas.microsoft.com/office/word/2010/wordprocessingInk" xmlns:wne="http://schemas.microsoft.com/office/word/2006/wordml" xmlns:wps="http://schemas.microsoft.com/office/word/2010/wordprocessingShape" mc:Ignorable="w14 w15 w16se w16cid w16 w16cex w16sdtdh w16du wp14">
+<w:document xmlns:wpc="http://schemas.microsoft.com/office/word/2010/wordprocessingCanvas" xmlns:cx="http://schemas.microsoft.com/office/drawing/2014/chartex" xmlns:cx1="http://schemas.microsoft.com/office/drawing/2015/9/8/chartex" xmlns:cx2="http://schemas.microsoft.com/office/drawing/2015/10/21/chartex" xmlns:cx3="http://schemas.microsoft.com/office/drawing/2016/5/9/chartex" xmlns:cx4="http://schemas.microsoft.com/office/drawing/2016/5/10/chartex" xmlns:cx5="http://schemas.microsoft.com/office/drawing/2016/5/11/chartex" xmlns:cx6="http://schemas.microsoft.com/office/drawing/2016/5/12/chartex" xmlns:cx7="http://schemas.microsoft.com/office/drawing/2016/5/13/chartex" xmlns:cx8="http://schemas.microsoft.com/office/drawing/2016/5/14/chartex" xmlns:mc="http://schemas.openxmlformats.org/markup-compatibility/2006" xmlns:aink="http://schemas.microsoft.com/office/drawing/2016/ink" xmlns:am3d="http://schemas.microsoft.com/office/drawing/2017/model3d" xmlns:o="urn:schemas-microsoft-com:office:office" xmlns:r="http://schemas.openxmlformats.org/officeDocument/2006/relationships" xmlns:m="http://schemas.openxmlformats.org/officeDocument/2006/math" xmlns:v="urn:schemas-microsoft-com:vml" xmlns:wp14="http://schemas.microsoft.com/office/word/2010/wordprocessingDrawing" xmlns:wp="http://schemas.openxmlformats.org/drawingml/2006/wordprocessingDrawing" xmlns:w10="urn:schemas-microsoft-com:office:word" xmlns:w="http://schemas.openxmlformats.org/wordprocessingml/2006/main" xmlns:w14="http://schemas.microsoft.com/office/word/2010/wordml" xmlns:w15="http://schemas.microsoft.com/office/word/2012/wordml" xmlns:w16cex="http://schemas.microsoft.com/office/word/2018/wordml/cex" xmlns:w16cid="http://schemas.microsoft.com/office/word/2016/wordml/cid" xmlns:w16="http://schemas.microsoft.com/office/word/2018/wordml" xmlns:w16sdtdh="http://schemas.microsoft.com/office/word/2020/wordml/sdtdatahash" xmlns:w16se="http://schemas.microsoft.com/office/word/2015/wordml/symex" xmlns:wpg="http://schemas.microsoft.com/office/word/2010/wordprocessingGroup" xmlns:wpi="http://schemas.microsoft.com/office/word/2010/wordprocessingInk" xmlns:wne="http://schemas.microsoft.com/office/word/2006/wordml" xmlns:wps="http://schemas.microsoft.com/office/word/2010/wordprocessingShape" mc:Ignorable="w14 w15 w16se w16cid w16 w16cex w16sdtdh wp14">
   <w:body>
     <w:p>
       <w:pPr>
@@ -19179,7 +19179,7 @@
           </mc:Choice>
           <mc:Fallback>
             <w:pict>
-              <v:group w14:anchorId="0E45B8CD" id="Group 1" o:spid="_x0000_s1026" style="position:absolute;margin-left:0;margin-top:0;width:609pt;height:11in;z-index:-15900160;mso-wrap-distance-left:0;mso-wrap-distance-right:0;mso-position-horizontal-relative:page;mso-position-vertical-relative:page" coordsize="77343,100583" o:gfxdata="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">
+              <v:group w14:anchorId="7DFE8D6D" id="Group 1" o:spid="_x0000_s1026" style="position:absolute;margin-left:0;margin-top:0;width:609pt;height:11in;z-index:-15900160;mso-wrap-distance-left:0;mso-wrap-distance-right:0;mso-position-horizontal-relative:page;mso-position-vertical-relative:page" coordsize="77343,100583" o:gfxdata="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">
                 <v:shape id="Graphic 2" o:spid="_x0000_s1027" style="position:absolute;left:4982;width:12;height:99085;visibility:visible;mso-wrap-style:square;v-text-anchor:top" coordsize="1270,9908540" o:gfxdata="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" path="m,l,9908540e" filled="f" strokeweight=".50794mm">
                   <v:stroke dashstyle="3 1"/>
                   <v:path arrowok="t"/>
@@ -19952,6 +19952,7 @@
       <w:pPr>
         <w:ind w:left="360"/>
         <w:rPr>
+          <w:rFonts w:ascii="Arial" w:hAnsi="Arial" w:cs="Arial"/>
           <w:b/>
           <w:bCs/>
           <w:color w:val="F69800"/>
@@ -19962,6 +19963,7 @@
       </w:pPr>
       <w:r>
         <w:rPr>
+          <w:rFonts w:ascii="Arial" w:hAnsi="Arial" w:cs="Arial"/>
           <w:b/>
           <w:bCs/>
           <w:color w:val="F69800"/>
@@ -19976,6 +19978,7 @@
       <w:pPr>
         <w:ind w:left="360"/>
         <w:rPr>
+          <w:rFonts w:ascii="Arial" w:hAnsi="Arial" w:cs="Arial"/>
           <w:b/>
           <w:bCs/>
           <w:color w:val="F69800"/>
@@ -19984,6 +19987,7 @@
       </w:pPr>
       <w:r>
         <w:rPr>
+          <w:rFonts w:ascii="Arial" w:hAnsi="Arial" w:cs="Arial"/>
           <w:b/>
           <w:bCs/>
           <w:color w:val="F69800"/>
@@ -19998,6 +20002,7 @@
       <w:pPr>
         <w:ind w:left="360"/>
         <w:rPr>
+          <w:rFonts w:ascii="Arial" w:hAnsi="Arial" w:cs="Arial"/>
           <w:b/>
           <w:bCs/>
           <w:color w:val="F69800"/>
@@ -20008,6 +20013,7 @@
       </w:pPr>
       <w:r>
         <w:rPr>
+          <w:rFonts w:ascii="Arial" w:hAnsi="Arial" w:cs="Arial"/>
           <w:b/>
           <w:bCs/>
           <w:color w:val="F69800"/>
@@ -20019,6 +20025,7 @@
       </w:r>
       <w:r>
         <w:rPr>
+          <w:rFonts w:ascii="Arial" w:hAnsi="Arial" w:cs="Arial"/>
           <w:b/>
           <w:bCs/>
           <w:color w:val="F69800"/>
@@ -20031,6 +20038,7 @@
       </w:r>
       <w:r>
         <w:rPr>
+          <w:rFonts w:ascii="Arial" w:hAnsi="Arial" w:cs="Arial"/>
           <w:b/>
           <w:bCs/>
           <w:color w:val="F69800"/>
@@ -20042,6 +20050,7 @@
       </w:r>
       <w:r>
         <w:rPr>
+          <w:rFonts w:ascii="Arial" w:hAnsi="Arial" w:cs="Arial"/>
           <w:b/>
           <w:bCs/>
           <w:color w:val="F69800"/>
@@ -20054,6 +20063,7 @@
       </w:r>
       <w:r>
         <w:rPr>
+          <w:rFonts w:ascii="Arial" w:hAnsi="Arial" w:cs="Arial"/>
           <w:b/>
           <w:bCs/>
           <w:color w:val="F69800"/>
@@ -20065,6 +20075,7 @@
       </w:r>
       <w:r>
         <w:rPr>
+          <w:rFonts w:ascii="Arial" w:hAnsi="Arial" w:cs="Arial"/>
           <w:b/>
           <w:bCs/>
           <w:color w:val="F69800"/>
@@ -20079,6 +20090,7 @@
       <w:pPr>
         <w:ind w:left="360"/>
         <w:rPr>
+          <w:rFonts w:ascii="Arial" w:hAnsi="Arial" w:cs="Arial"/>
           <w:b/>
           <w:bCs/>
           <w:color w:val="F69800"/>
@@ -20092,6 +20104,7 @@
       <w:pPr>
         <w:ind w:left="360"/>
         <w:rPr>
+          <w:rFonts w:ascii="Arial" w:hAnsi="Arial" w:cs="Arial"/>
           <w:b/>
           <w:bCs/>
           <w:color w:val="F69800"/>
@@ -20102,6 +20115,7 @@
       </w:pPr>
       <w:r>
         <w:rPr>
+          <w:rFonts w:ascii="Arial" w:hAnsi="Arial" w:cs="Arial"/>
           <w:b/>
           <w:bCs/>
           <w:color w:val="F69800"/>
@@ -20113,6 +20127,7 @@
       </w:r>
       <w:r>
         <w:rPr>
+          <w:rFonts w:ascii="Arial" w:hAnsi="Arial" w:cs="Arial"/>
           <w:b/>
           <w:bCs/>
           <w:color w:val="F69800"/>
@@ -20127,6 +20142,7 @@
       <w:pPr>
         <w:ind w:left="360"/>
         <w:rPr>
+          <w:rFonts w:ascii="Arial" w:hAnsi="Arial" w:cs="Arial"/>
           <w:b/>
           <w:bCs/>
           <w:color w:val="F69800"/>
@@ -20139,6 +20155,7 @@
       <w:pPr>
         <w:ind w:left="360"/>
         <w:rPr>
+          <w:rFonts w:ascii="Arial" w:hAnsi="Arial" w:cs="Arial"/>
           <w:b/>
           <w:bCs/>
           <w:color w:val="F69800"/>
@@ -20148,6 +20165,7 @@
       </w:pPr>
       <w:r>
         <w:rPr>
+          <w:rFonts w:ascii="Arial" w:hAnsi="Arial" w:cs="Arial"/>
           <w:b/>
           <w:bCs/>
           <w:color w:val="F69800"/>
@@ -20159,6 +20177,7 @@
       </w:r>
       <w:r>
         <w:rPr>
+          <w:rFonts w:ascii="Arial" w:hAnsi="Arial" w:cs="Arial"/>
           <w:b/>
           <w:bCs/>
           <w:color w:val="F69800"/>
@@ -20171,6 +20190,7 @@
       </w:r>
       <w:r>
         <w:rPr>
+          <w:rFonts w:ascii="Arial" w:hAnsi="Arial" w:cs="Arial"/>
           <w:b/>
           <w:bCs/>
           <w:color w:val="F69800"/>
@@ -20182,6 +20202,7 @@
       </w:r>
       <w:r>
         <w:rPr>
+          <w:rFonts w:ascii="Arial" w:hAnsi="Arial" w:cs="Arial"/>
           <w:b/>
           <w:bCs/>
           <w:color w:val="F69800"/>
@@ -20194,6 +20215,7 @@
       </w:r>
       <w:r>
         <w:rPr>
+          <w:rFonts w:ascii="Arial" w:hAnsi="Arial" w:cs="Arial"/>
           <w:b/>
           <w:bCs/>
           <w:color w:val="F69800"/>
@@ -20205,6 +20227,7 @@
       </w:r>
       <w:r>
         <w:rPr>
+          <w:rFonts w:ascii="Arial" w:hAnsi="Arial" w:cs="Arial"/>
           <w:b/>
           <w:bCs/>
           <w:color w:val="F69800"/>
@@ -20217,6 +20240,7 @@
       </w:r>
       <w:r>
         <w:rPr>
+          <w:rFonts w:ascii="Arial" w:hAnsi="Arial" w:cs="Arial"/>
           <w:b/>
           <w:bCs/>
           <w:color w:val="F69800"/>
@@ -20229,6 +20253,7 @@
       </w:r>
       <w:r>
         <w:rPr>
+          <w:rFonts w:ascii="Arial" w:hAnsi="Arial" w:cs="Arial"/>
           <w:b/>
           <w:bCs/>
           <w:color w:val="F69800"/>
@@ -20237,7 +20262,33 @@
           <w:sz w:val="26"/>
           <w:szCs w:val="26"/>
         </w:rPr>
-        <w:t>: [[localDate]]</w:t>
+        <w:t>: [[</w:t>
+      </w:r>
+      <w:r>
+        <w:rPr>
+          <w:rFonts w:ascii="Arial" w:hAnsi="Arial" w:cs="Arial"/>
+          <w:b/>
+          <w:bCs/>
+          <w:color w:val="F69800"/>
+          <w:spacing w:val="-2"/>
+          <w:w w:val="110"/>
+          <w:sz w:val="26"/>
+          <w:szCs w:val="26"/>
+        </w:rPr>
+        <w:t>Fecha</w:t>
+      </w:r>
+      <w:r>
+        <w:rPr>
+          <w:rFonts w:ascii="Arial" w:hAnsi="Arial" w:cs="Arial"/>
+          <w:b/>
+          <w:bCs/>
+          <w:color w:val="F69800"/>
+          <w:spacing w:val="-2"/>
+          <w:w w:val="110"/>
+          <w:sz w:val="26"/>
+          <w:szCs w:val="26"/>
+        </w:rPr>
+        <w:t>]]</w:t>
       </w:r>
     </w:p>
     <w:sectPr>
@@ -20251,7 +20302,7 @@
 </file>
 
 <file path=word/styles.xml><?xml version="1.0" encoding="utf-8"?>
-<w:styles xmlns:mc="http://schemas.openxmlformats.org/markup-compatibility/2006" xmlns:r="http://schemas.openxmlformats.org/officeDocument/2006/relationships" xmlns:w="http://schemas.openxmlformats.org/wordprocessingml/2006/main" xmlns:w14="http://schemas.microsoft.com/office/word/2010/wordml" xmlns:w15="http://schemas.microsoft.com/office/word/2012/wordml" xmlns:w16cex="http://schemas.microsoft.com/office/word/2018/wordml/cex" xmlns:w16cid="http://schemas.microsoft.com/office/word/2016/wordml/cid" xmlns:w16="http://schemas.microsoft.com/office/word/2018/wordml" xmlns:w16du="http://schemas.microsoft.com/office/word/2023/wordml/word16du" xmlns:w16sdtdh="http://schemas.microsoft.com/office/word/2020/wordml/sdtdatahash" xmlns:w16se="http://schemas.microsoft.com/office/word/2015/wordml/symex" mc:Ignorable="w14 w15 w16se w16cid w16 w16cex w16sdtdh w16du">
+<w:styles xmlns:mc="http://schemas.openxmlformats.org/markup-compatibility/2006" xmlns:r="http://schemas.openxmlformats.org/officeDocument/2006/relationships" xmlns:w="http://schemas.openxmlformats.org/wordprocessingml/2006/main" xmlns:w14="http://schemas.microsoft.com/office/word/2010/wordml" xmlns:w15="http://schemas.microsoft.com/office/word/2012/wordml" xmlns:w16cex="http://schemas.microsoft.com/office/word/2018/wordml/cex" xmlns:w16cid="http://schemas.microsoft.com/office/word/2016/wordml/cid" xmlns:w16="http://schemas.microsoft.com/office/word/2018/wordml" xmlns:w16sdtdh="http://schemas.microsoft.com/office/word/2020/wordml/sdtdatahash" xmlns:w16se="http://schemas.microsoft.com/office/word/2015/wordml/symex" mc:Ignorable="w14 w15 w16se w16cid w16 w16cex w16sdtdh">
   <w:docDefaults>
     <w:rPrDefault>
       <w:rPr>

</xml_diff>